<commit_message>
Faltan especificar los componentes de software
</commit_message>
<xml_diff>
--- a/docs/HAMANN-PABLO-ALEJANDRO-TP3.docx
+++ b/docs/HAMANN-PABLO-ALEJANDRO-TP3.docx
@@ -703,7 +703,6 @@
               <w:rFonts w:asciiTheme="minorHAnsi" w:hAnsiTheme="minorHAnsi" w:cstheme="minorBidi"/>
               <w:noProof/>
               <w:kern w:val="2"/>
-              <w:sz w:val="24"/>
               <w14:ligatures w14:val="standardContextual"/>
             </w:rPr>
           </w:pPr>
@@ -799,7 +798,6 @@
               <w:rFonts w:asciiTheme="minorHAnsi" w:hAnsiTheme="minorHAnsi" w:cstheme="minorBidi"/>
               <w:noProof/>
               <w:kern w:val="2"/>
-              <w:sz w:val="24"/>
               <w14:ligatures w14:val="standardContextual"/>
             </w:rPr>
           </w:pPr>
@@ -873,7 +871,6 @@
               <w:rFonts w:asciiTheme="minorHAnsi" w:hAnsiTheme="minorHAnsi" w:cstheme="minorBidi"/>
               <w:noProof/>
               <w:kern w:val="2"/>
-              <w:sz w:val="24"/>
               <w14:ligatures w14:val="standardContextual"/>
             </w:rPr>
           </w:pPr>
@@ -945,7 +942,6 @@
               <w:rFonts w:asciiTheme="minorHAnsi" w:hAnsiTheme="minorHAnsi" w:cstheme="minorBidi"/>
               <w:noProof/>
               <w:kern w:val="2"/>
-              <w:sz w:val="24"/>
               <w14:ligatures w14:val="standardContextual"/>
             </w:rPr>
           </w:pPr>
@@ -1017,7 +1013,6 @@
               <w:rFonts w:asciiTheme="minorHAnsi" w:hAnsiTheme="minorHAnsi" w:cstheme="minorBidi"/>
               <w:noProof/>
               <w:kern w:val="2"/>
-              <w:sz w:val="24"/>
               <w14:ligatures w14:val="standardContextual"/>
             </w:rPr>
           </w:pPr>
@@ -1334,6 +1329,12 @@
           <w:sz w:val="20"/>
           <w:szCs w:val="22"/>
         </w:rPr>
+      </w:r>
+      <w:r>
+        <w:rPr>
+          <w:sz w:val="20"/>
+          <w:szCs w:val="22"/>
+        </w:rPr>
         <w:fldChar w:fldCharType="separate"/>
       </w:r>
       <w:r>
@@ -1453,26 +1454,88 @@
       </w:pPr>
       <w:bookmarkStart w:id="2" w:name="_Toc199145173"/>
       <w:r>
+        <w:lastRenderedPageBreak/>
         <w:t>Sección 1: Diagrama de arquitectura de implementación</w:t>
       </w:r>
       <w:bookmarkEnd w:id="2"/>
     </w:p>
     <w:p>
-      <w:proofErr w:type="spellStart"/>
       <w:r>
-        <w:t>A</w:t>
+        <w:rPr>
+          <w:noProof/>
+        </w:rPr>
+        <w:drawing>
+          <wp:inline distT="0" distB="0" distL="0" distR="0" wp14:anchorId="336D379C" wp14:editId="7EA152F7">
+            <wp:extent cx="5617210" cy="6760210"/>
+            <wp:effectExtent l="0" t="0" r="2540" b="2540"/>
+            <wp:docPr id="1450170815" name="Imagen 14"/>
+            <wp:cNvGraphicFramePr>
+              <a:graphicFrameLocks xmlns:a="http://schemas.openxmlformats.org/drawingml/2006/main" noChangeAspect="1"/>
+            </wp:cNvGraphicFramePr>
+            <a:graphic xmlns:a="http://schemas.openxmlformats.org/drawingml/2006/main">
+              <a:graphicData uri="http://schemas.openxmlformats.org/drawingml/2006/picture">
+                <pic:pic xmlns:pic="http://schemas.openxmlformats.org/drawingml/2006/picture">
+                  <pic:nvPicPr>
+                    <pic:cNvPr id="0" name="Picture 3"/>
+                    <pic:cNvPicPr>
+                      <a:picLocks noChangeAspect="1" noChangeArrowheads="1"/>
+                    </pic:cNvPicPr>
+                  </pic:nvPicPr>
+                  <pic:blipFill>
+                    <a:blip r:embed="rId20">
+                      <a:extLst>
+                        <a:ext uri="{28A0092B-C50C-407E-A947-70E740481C1C}">
+                          <a14:useLocalDpi xmlns:a14="http://schemas.microsoft.com/office/drawing/2010/main" val="0"/>
+                        </a:ext>
+                      </a:extLst>
+                    </a:blip>
+                    <a:srcRect/>
+                    <a:stretch>
+                      <a:fillRect/>
+                    </a:stretch>
+                  </pic:blipFill>
+                  <pic:spPr bwMode="auto">
+                    <a:xfrm>
+                      <a:off x="0" y="0"/>
+                      <a:ext cx="5617210" cy="6760210"/>
+                    </a:xfrm>
+                    <a:prstGeom prst="rect">
+                      <a:avLst/>
+                    </a:prstGeom>
+                    <a:noFill/>
+                    <a:ln>
+                      <a:noFill/>
+                    </a:ln>
+                  </pic:spPr>
+                </pic:pic>
+              </a:graphicData>
+            </a:graphic>
+          </wp:inline>
+        </w:drawing>
       </w:r>
+    </w:p>
+    <w:p>
+      <w:pPr>
+        <w:spacing w:after="200" w:line="360" w:lineRule="auto"/>
+        <w:rPr>
+          <w:rFonts w:eastAsiaTheme="majorEastAsia" w:cstheme="majorBidi"/>
+          <w:b/>
+          <w:bCs/>
+          <w:sz w:val="28"/>
+          <w:szCs w:val="28"/>
+        </w:rPr>
+      </w:pPr>
+      <w:bookmarkStart w:id="3" w:name="_Toc199145174"/>
       <w:r>
-        <w:t>sd</w:t>
+        <w:br w:type="page"/>
       </w:r>
-      <w:proofErr w:type="spellEnd"/>
     </w:p>
     <w:p>
       <w:pPr>
         <w:pStyle w:val="Ttulo1"/>
       </w:pPr>
-      <w:bookmarkStart w:id="3" w:name="_Toc199145174"/>
       <w:r>
+        <w:lastRenderedPageBreak/>
         <w:t>Sección 2: Tabla con detalle de función de cada componente</w:t>
       </w:r>
       <w:bookmarkEnd w:id="3"/>
@@ -1482,12 +1545,1729 @@
         <w:t>Tabla</w:t>
       </w:r>
     </w:p>
+    <w:tbl>
+      <w:tblPr>
+        <w:tblStyle w:val="Tablaconcuadrcula"/>
+        <w:tblW w:w="5000" w:type="pct"/>
+        <w:tblBorders>
+          <w:top w:val="single" w:sz="4" w:space="0" w:color="B8CCE4" w:themeColor="accent1" w:themeTint="66"/>
+          <w:left w:val="single" w:sz="4" w:space="0" w:color="B8CCE4" w:themeColor="accent1" w:themeTint="66"/>
+          <w:bottom w:val="single" w:sz="4" w:space="0" w:color="B8CCE4" w:themeColor="accent1" w:themeTint="66"/>
+          <w:right w:val="single" w:sz="4" w:space="0" w:color="B8CCE4" w:themeColor="accent1" w:themeTint="66"/>
+          <w:insideH w:val="single" w:sz="4" w:space="0" w:color="B8CCE4" w:themeColor="accent1" w:themeTint="66"/>
+          <w:insideV w:val="single" w:sz="4" w:space="0" w:color="B8CCE4" w:themeColor="accent1" w:themeTint="66"/>
+        </w:tblBorders>
+        <w:tblLook w:val="04A0" w:firstRow="1" w:lastRow="0" w:firstColumn="1" w:lastColumn="0" w:noHBand="0" w:noVBand="1"/>
+      </w:tblPr>
+      <w:tblGrid>
+        <w:gridCol w:w="3396"/>
+        <w:gridCol w:w="5439"/>
+      </w:tblGrid>
+      <w:tr>
+        <w:tc>
+          <w:tcPr>
+            <w:tcW w:w="1922" w:type="pct"/>
+            <w:shd w:val="clear" w:color="auto" w:fill="4F81BD" w:themeFill="accent1"/>
+          </w:tcPr>
+          <w:p>
+            <w:pPr>
+              <w:rPr>
+                <w:b/>
+                <w:bCs/>
+                <w:color w:val="F2F2F2" w:themeColor="background1" w:themeShade="F2"/>
+              </w:rPr>
+            </w:pPr>
+            <w:r>
+              <w:rPr>
+                <w:b/>
+                <w:bCs/>
+                <w:color w:val="F2F2F2" w:themeColor="background1" w:themeShade="F2"/>
+              </w:rPr>
+              <w:t>Componente</w:t>
+            </w:r>
+          </w:p>
+        </w:tc>
+        <w:tc>
+          <w:tcPr>
+            <w:tcW w:w="3078" w:type="pct"/>
+            <w:shd w:val="clear" w:color="auto" w:fill="4F81BD" w:themeFill="accent1"/>
+          </w:tcPr>
+          <w:p>
+            <w:pPr>
+              <w:rPr>
+                <w:b/>
+                <w:bCs/>
+                <w:color w:val="F2F2F2" w:themeColor="background1" w:themeShade="F2"/>
+              </w:rPr>
+            </w:pPr>
+            <w:r>
+              <w:rPr>
+                <w:b/>
+                <w:bCs/>
+                <w:color w:val="F2F2F2" w:themeColor="background1" w:themeShade="F2"/>
+              </w:rPr>
+              <w:t>Descripción función</w:t>
+            </w:r>
+          </w:p>
+        </w:tc>
+      </w:tr>
+      <w:tr>
+        <w:tc>
+          <w:tcPr>
+            <w:tcW w:w="1922" w:type="pct"/>
+            <w:vAlign w:val="center"/>
+          </w:tcPr>
+          <w:p>
+            <w:pPr>
+              <w:jc w:val="left"/>
+              <w:rPr>
+                <w:rFonts w:eastAsia="Times New Roman"/>
+                <w:b/>
+                <w:bCs/>
+                <w:color w:val="000000"/>
+                <w:sz w:val="20"/>
+                <w:szCs w:val="20"/>
+              </w:rPr>
+            </w:pPr>
+            <w:r>
+              <w:rPr>
+                <w:rFonts w:eastAsia="Times New Roman"/>
+                <w:b/>
+                <w:bCs/>
+                <w:color w:val="000000"/>
+                <w:sz w:val="20"/>
+                <w:szCs w:val="20"/>
+              </w:rPr>
+              <w:t>Workstation Cliente</w:t>
+            </w:r>
+          </w:p>
+          <w:p>
+            <w:pPr>
+              <w:jc w:val="left"/>
+              <w:rPr>
+                <w:rFonts w:eastAsia="Times New Roman"/>
+                <w:color w:val="000000"/>
+                <w:sz w:val="20"/>
+                <w:szCs w:val="20"/>
+              </w:rPr>
+            </w:pPr>
+            <w:r>
+              <w:rPr>
+                <w:rFonts w:eastAsia="Times New Roman"/>
+                <w:b/>
+                <w:bCs/>
+                <w:color w:val="000000"/>
+                <w:sz w:val="20"/>
+                <w:szCs w:val="20"/>
+              </w:rPr>
+              <w:t>Cliente remoto</w:t>
+            </w:r>
+            <w:r>
+              <w:rPr>
+                <w:rFonts w:eastAsia="Times New Roman"/>
+                <w:color w:val="000000"/>
+                <w:sz w:val="20"/>
+                <w:szCs w:val="20"/>
+              </w:rPr>
+              <w:t xml:space="preserve"> (laptop / móvil)</w:t>
+            </w:r>
+          </w:p>
+        </w:tc>
+        <w:tc>
+          <w:tcPr>
+            <w:tcW w:w="3078" w:type="pct"/>
+            <w:vAlign w:val="center"/>
+          </w:tcPr>
+          <w:p>
+            <w:pPr>
+              <w:jc w:val="left"/>
+              <w:rPr>
+                <w:rFonts w:eastAsia="Times New Roman"/>
+                <w:color w:val="000000"/>
+                <w:sz w:val="20"/>
+                <w:szCs w:val="20"/>
+              </w:rPr>
+            </w:pPr>
+            <w:r>
+              <w:rPr>
+                <w:rFonts w:eastAsia="Times New Roman"/>
+                <w:color w:val="000000"/>
+                <w:sz w:val="20"/>
+                <w:szCs w:val="20"/>
+              </w:rPr>
+              <w:t>Interfaz de usuario (PC, laptop o móvil) desde la que se envían las solicitudes al sistema de registro de pedidos.</w:t>
+            </w:r>
+          </w:p>
+        </w:tc>
+      </w:tr>
+      <w:tr>
+        <w:tc>
+          <w:tcPr>
+            <w:tcW w:w="1922" w:type="pct"/>
+            <w:vAlign w:val="center"/>
+          </w:tcPr>
+          <w:p>
+            <w:pPr>
+              <w:jc w:val="left"/>
+              <w:rPr>
+                <w:b/>
+                <w:bCs/>
+                <w:color w:val="000000"/>
+                <w:sz w:val="20"/>
+                <w:szCs w:val="20"/>
+              </w:rPr>
+            </w:pPr>
+            <w:r>
+              <w:rPr>
+                <w:b/>
+                <w:bCs/>
+                <w:color w:val="000000"/>
+                <w:sz w:val="20"/>
+                <w:szCs w:val="20"/>
+              </w:rPr>
+              <w:t>Firewall</w:t>
+            </w:r>
+          </w:p>
+        </w:tc>
+        <w:tc>
+          <w:tcPr>
+            <w:tcW w:w="3078" w:type="pct"/>
+            <w:vAlign w:val="center"/>
+          </w:tcPr>
+          <w:p>
+            <w:pPr>
+              <w:jc w:val="left"/>
+              <w:rPr>
+                <w:color w:val="000000"/>
+                <w:sz w:val="20"/>
+                <w:szCs w:val="20"/>
+              </w:rPr>
+            </w:pPr>
+            <w:r>
+              <w:rPr>
+                <w:color w:val="000000"/>
+                <w:sz w:val="20"/>
+                <w:szCs w:val="20"/>
+              </w:rPr>
+              <w:t>Filtra y controla el acceso de red, aplicando políticas de seguridad entre la capa de interfaz y la capa de comunicaciones.</w:t>
+            </w:r>
+          </w:p>
+        </w:tc>
+      </w:tr>
+      <w:tr>
+        <w:tc>
+          <w:tcPr>
+            <w:tcW w:w="1922" w:type="pct"/>
+            <w:vAlign w:val="center"/>
+          </w:tcPr>
+          <w:p>
+            <w:pPr>
+              <w:jc w:val="left"/>
+              <w:rPr>
+                <w:b/>
+                <w:bCs/>
+                <w:color w:val="000000"/>
+                <w:sz w:val="20"/>
+                <w:szCs w:val="20"/>
+              </w:rPr>
+            </w:pPr>
+            <w:r>
+              <w:rPr>
+                <w:b/>
+                <w:bCs/>
+                <w:color w:val="000000"/>
+                <w:sz w:val="20"/>
+                <w:szCs w:val="20"/>
+              </w:rPr>
+              <w:t>Router</w:t>
+            </w:r>
+          </w:p>
+        </w:tc>
+        <w:tc>
+          <w:tcPr>
+            <w:tcW w:w="3078" w:type="pct"/>
+            <w:vAlign w:val="center"/>
+          </w:tcPr>
+          <w:p>
+            <w:pPr>
+              <w:jc w:val="left"/>
+              <w:rPr>
+                <w:color w:val="000000"/>
+                <w:sz w:val="20"/>
+                <w:szCs w:val="20"/>
+              </w:rPr>
+            </w:pPr>
+            <w:r>
+              <w:rPr>
+                <w:color w:val="000000"/>
+                <w:sz w:val="20"/>
+                <w:szCs w:val="20"/>
+              </w:rPr>
+              <w:t>Dirige el tráfico IP entre la capa de interfaz y la capa de comunicaciones, asegurando conectividad de red.</w:t>
+            </w:r>
+          </w:p>
+        </w:tc>
+      </w:tr>
+      <w:tr>
+        <w:tc>
+          <w:tcPr>
+            <w:tcW w:w="1922" w:type="pct"/>
+            <w:vAlign w:val="center"/>
+          </w:tcPr>
+          <w:p>
+            <w:pPr>
+              <w:jc w:val="left"/>
+              <w:rPr>
+                <w:b/>
+                <w:bCs/>
+                <w:color w:val="000000"/>
+                <w:sz w:val="20"/>
+                <w:szCs w:val="20"/>
+              </w:rPr>
+            </w:pPr>
+            <w:r>
+              <w:rPr>
+                <w:b/>
+                <w:bCs/>
+                <w:color w:val="000000"/>
+                <w:sz w:val="20"/>
+                <w:szCs w:val="20"/>
+              </w:rPr>
+              <w:t xml:space="preserve">Load </w:t>
+            </w:r>
+            <w:proofErr w:type="spellStart"/>
+            <w:r>
+              <w:rPr>
+                <w:b/>
+                <w:bCs/>
+                <w:color w:val="000000"/>
+                <w:sz w:val="20"/>
+                <w:szCs w:val="20"/>
+              </w:rPr>
+              <w:t>Balancer</w:t>
+            </w:r>
+            <w:proofErr w:type="spellEnd"/>
+            <w:r>
+              <w:rPr>
+                <w:b/>
+                <w:bCs/>
+                <w:color w:val="000000"/>
+                <w:sz w:val="20"/>
+                <w:szCs w:val="20"/>
+              </w:rPr>
+              <w:t xml:space="preserve"> TCP</w:t>
+            </w:r>
+          </w:p>
+          <w:p>
+            <w:pPr>
+              <w:jc w:val="left"/>
+              <w:rPr>
+                <w:color w:val="000000"/>
+                <w:sz w:val="20"/>
+                <w:szCs w:val="20"/>
+              </w:rPr>
+            </w:pPr>
+            <w:r>
+              <w:rPr>
+                <w:color w:val="000000"/>
+                <w:sz w:val="20"/>
+                <w:szCs w:val="20"/>
+              </w:rPr>
+              <w:t>(</w:t>
+            </w:r>
+            <w:proofErr w:type="spellStart"/>
+            <w:r>
+              <w:rPr>
+                <w:i/>
+                <w:iCs/>
+                <w:color w:val="000000"/>
+                <w:sz w:val="20"/>
+                <w:szCs w:val="20"/>
+              </w:rPr>
+              <w:t>HAProxy</w:t>
+            </w:r>
+            <w:proofErr w:type="spellEnd"/>
+            <w:r>
+              <w:rPr>
+                <w:color w:val="000000"/>
+                <w:sz w:val="20"/>
+                <w:szCs w:val="20"/>
+              </w:rPr>
+              <w:t xml:space="preserve"> en modo TCP u otros</w:t>
+            </w:r>
+            <w:r>
+              <w:rPr>
+                <w:color w:val="000000"/>
+                <w:sz w:val="20"/>
+                <w:szCs w:val="20"/>
+              </w:rPr>
+              <w:t>)</w:t>
+            </w:r>
+          </w:p>
+        </w:tc>
+        <w:tc>
+          <w:tcPr>
+            <w:tcW w:w="3078" w:type="pct"/>
+            <w:vAlign w:val="center"/>
+          </w:tcPr>
+          <w:p>
+            <w:pPr>
+              <w:jc w:val="left"/>
+              <w:rPr>
+                <w:color w:val="000000"/>
+                <w:sz w:val="20"/>
+                <w:szCs w:val="20"/>
+              </w:rPr>
+            </w:pPr>
+            <w:r>
+              <w:rPr>
+                <w:color w:val="000000"/>
+                <w:sz w:val="20"/>
+                <w:szCs w:val="20"/>
+              </w:rPr>
+              <w:t>Reparte las conexiones TCP entrantes de manera uniforme entre los Serv</w:t>
+            </w:r>
+            <w:r>
+              <w:rPr>
+                <w:color w:val="000000"/>
+                <w:sz w:val="20"/>
+                <w:szCs w:val="20"/>
+              </w:rPr>
+              <w:t>idores Transaccionales</w:t>
+            </w:r>
+            <w:r>
+              <w:rPr>
+                <w:color w:val="000000"/>
+                <w:sz w:val="20"/>
+                <w:szCs w:val="20"/>
+              </w:rPr>
+              <w:t>, garantizando alta disponibilidad y balanceo de carga.</w:t>
+            </w:r>
+            <w:r>
+              <w:rPr>
+                <w:color w:val="000000"/>
+                <w:sz w:val="20"/>
+                <w:szCs w:val="20"/>
+              </w:rPr>
+              <w:t xml:space="preserve"> </w:t>
+            </w:r>
+            <w:proofErr w:type="spellStart"/>
+            <w:r>
+              <w:rPr>
+                <w:i/>
+                <w:iCs/>
+                <w:color w:val="000000"/>
+                <w:sz w:val="20"/>
+                <w:szCs w:val="20"/>
+              </w:rPr>
+              <w:t>HAProxy</w:t>
+            </w:r>
+            <w:proofErr w:type="spellEnd"/>
+            <w:r>
+              <w:rPr>
+                <w:color w:val="000000"/>
+                <w:sz w:val="20"/>
+                <w:szCs w:val="20"/>
+              </w:rPr>
+              <w:t xml:space="preserve"> es uno de tantos productos, </w:t>
+            </w:r>
+            <w:r>
+              <w:rPr>
+                <w:color w:val="000000"/>
+                <w:sz w:val="20"/>
+                <w:szCs w:val="20"/>
+              </w:rPr>
+              <w:t xml:space="preserve">solo que este </w:t>
+            </w:r>
+            <w:r>
+              <w:rPr>
+                <w:color w:val="000000"/>
+                <w:sz w:val="20"/>
+                <w:szCs w:val="20"/>
+              </w:rPr>
+              <w:t>tiene la particularidad de poder trabajar tanto en capa 4 (modo TCP</w:t>
+            </w:r>
+            <w:r>
+              <w:rPr>
+                <w:color w:val="000000"/>
+                <w:sz w:val="20"/>
+                <w:szCs w:val="20"/>
+              </w:rPr>
+              <w:t xml:space="preserve">, donde puede funcionar como un </w:t>
+            </w:r>
+            <w:proofErr w:type="spellStart"/>
+            <w:r>
+              <w:rPr>
+                <w:color w:val="000000"/>
+                <w:sz w:val="20"/>
+                <w:szCs w:val="20"/>
+              </w:rPr>
+              <w:t>balanceadro</w:t>
+            </w:r>
+            <w:proofErr w:type="spellEnd"/>
+            <w:r>
+              <w:rPr>
+                <w:color w:val="000000"/>
+                <w:sz w:val="20"/>
+                <w:szCs w:val="20"/>
+              </w:rPr>
+              <w:t xml:space="preserve"> de carga</w:t>
+            </w:r>
+            <w:r>
+              <w:rPr>
+                <w:color w:val="000000"/>
+                <w:sz w:val="20"/>
+                <w:szCs w:val="20"/>
+              </w:rPr>
+              <w:t>) como en capa 7 (a nivel de aplicación: HTTP SSL</w:t>
+            </w:r>
+            <w:r>
+              <w:rPr>
+                <w:color w:val="000000"/>
+                <w:sz w:val="20"/>
+                <w:szCs w:val="20"/>
+              </w:rPr>
+              <w:t xml:space="preserve">, en donde sería un proxy reverso más tradicional, como </w:t>
+            </w:r>
+            <w:proofErr w:type="spellStart"/>
+            <w:r>
+              <w:rPr>
+                <w:color w:val="000000"/>
+                <w:sz w:val="20"/>
+                <w:szCs w:val="20"/>
+              </w:rPr>
+              <w:t>nginx</w:t>
+            </w:r>
+            <w:proofErr w:type="spellEnd"/>
+            <w:r>
+              <w:rPr>
+                <w:color w:val="000000"/>
+                <w:sz w:val="20"/>
+                <w:szCs w:val="20"/>
+              </w:rPr>
+              <w:t xml:space="preserve"> en modo proxy reverso o similares</w:t>
+            </w:r>
+            <w:r>
+              <w:rPr>
+                <w:color w:val="000000"/>
+                <w:sz w:val="20"/>
+                <w:szCs w:val="20"/>
+              </w:rPr>
+              <w:t>).</w:t>
+            </w:r>
+          </w:p>
+        </w:tc>
+      </w:tr>
+      <w:tr>
+        <w:tc>
+          <w:tcPr>
+            <w:tcW w:w="1922" w:type="pct"/>
+            <w:vAlign w:val="center"/>
+          </w:tcPr>
+          <w:p>
+            <w:pPr>
+              <w:jc w:val="left"/>
+              <w:rPr>
+                <w:color w:val="000000"/>
+                <w:sz w:val="20"/>
+                <w:szCs w:val="20"/>
+              </w:rPr>
+            </w:pPr>
+            <w:proofErr w:type="spellStart"/>
+            <w:r>
+              <w:rPr>
+                <w:b/>
+                <w:bCs/>
+                <w:color w:val="000000"/>
+                <w:sz w:val="20"/>
+                <w:szCs w:val="20"/>
+              </w:rPr>
+              <w:t>Transac</w:t>
+            </w:r>
+            <w:r>
+              <w:rPr>
+                <w:b/>
+                <w:bCs/>
+                <w:color w:val="000000"/>
+                <w:sz w:val="20"/>
+                <w:szCs w:val="20"/>
+              </w:rPr>
+              <w:t>t</w:t>
+            </w:r>
+            <w:r>
+              <w:rPr>
+                <w:b/>
+                <w:bCs/>
+                <w:color w:val="000000"/>
+                <w:sz w:val="20"/>
+                <w:szCs w:val="20"/>
+              </w:rPr>
+              <w:t>ional</w:t>
+            </w:r>
+            <w:proofErr w:type="spellEnd"/>
+            <w:r>
+              <w:rPr>
+                <w:b/>
+                <w:bCs/>
+                <w:color w:val="000000"/>
+                <w:sz w:val="20"/>
+                <w:szCs w:val="20"/>
+              </w:rPr>
+              <w:t xml:space="preserve"> </w:t>
+            </w:r>
+            <w:r>
+              <w:rPr>
+                <w:b/>
+                <w:bCs/>
+                <w:color w:val="000000"/>
+                <w:sz w:val="20"/>
+                <w:szCs w:val="20"/>
+              </w:rPr>
+              <w:t>Server</w:t>
+            </w:r>
+            <w:r>
+              <w:rPr>
+                <w:color w:val="000000"/>
+                <w:sz w:val="20"/>
+                <w:szCs w:val="20"/>
+              </w:rPr>
+              <w:t xml:space="preserve"> / </w:t>
+            </w:r>
+            <w:r>
+              <w:rPr>
+                <w:color w:val="000000"/>
+                <w:sz w:val="20"/>
+                <w:szCs w:val="20"/>
+              </w:rPr>
+              <w:t>Servidor Transaccional</w:t>
+            </w:r>
+          </w:p>
+          <w:p>
+            <w:pPr>
+              <w:jc w:val="left"/>
+              <w:rPr>
+                <w:color w:val="000000"/>
+                <w:sz w:val="20"/>
+                <w:szCs w:val="20"/>
+              </w:rPr>
+            </w:pPr>
+            <w:r>
+              <w:rPr>
+                <w:color w:val="000000"/>
+                <w:sz w:val="20"/>
+                <w:szCs w:val="20"/>
+              </w:rPr>
+              <w:t>(Primario)</w:t>
+            </w:r>
+          </w:p>
+        </w:tc>
+        <w:tc>
+          <w:tcPr>
+            <w:tcW w:w="3078" w:type="pct"/>
+            <w:vAlign w:val="center"/>
+          </w:tcPr>
+          <w:p>
+            <w:pPr>
+              <w:jc w:val="left"/>
+              <w:rPr>
+                <w:color w:val="000000"/>
+                <w:sz w:val="20"/>
+                <w:szCs w:val="20"/>
+              </w:rPr>
+            </w:pPr>
+            <w:r>
+              <w:rPr>
+                <w:color w:val="000000"/>
+                <w:sz w:val="20"/>
+                <w:szCs w:val="20"/>
+              </w:rPr>
+              <w:t>Ejecuta la lógica de aplicación y coordina el inicio/</w:t>
+            </w:r>
+            <w:proofErr w:type="spellStart"/>
+            <w:r>
+              <w:rPr>
+                <w:color w:val="000000"/>
+                <w:sz w:val="20"/>
+                <w:szCs w:val="20"/>
+              </w:rPr>
+              <w:t>commit</w:t>
+            </w:r>
+            <w:proofErr w:type="spellEnd"/>
+            <w:r>
+              <w:rPr>
+                <w:color w:val="000000"/>
+                <w:sz w:val="20"/>
+                <w:szCs w:val="20"/>
+              </w:rPr>
+              <w:t>/</w:t>
+            </w:r>
+            <w:proofErr w:type="spellStart"/>
+            <w:r>
+              <w:rPr>
+                <w:color w:val="000000"/>
+                <w:sz w:val="20"/>
+                <w:szCs w:val="20"/>
+              </w:rPr>
+              <w:t>rollback</w:t>
+            </w:r>
+            <w:proofErr w:type="spellEnd"/>
+            <w:r>
+              <w:rPr>
+                <w:color w:val="000000"/>
+                <w:sz w:val="20"/>
+                <w:szCs w:val="20"/>
+              </w:rPr>
+              <w:t xml:space="preserve"> de transacciones; punto principal de procesamiento de pedidos.</w:t>
+            </w:r>
+          </w:p>
+        </w:tc>
+      </w:tr>
+      <w:tr>
+        <w:tc>
+          <w:tcPr>
+            <w:tcW w:w="1922" w:type="pct"/>
+            <w:vAlign w:val="center"/>
+          </w:tcPr>
+          <w:p>
+            <w:pPr>
+              <w:jc w:val="left"/>
+              <w:rPr>
+                <w:color w:val="000000"/>
+                <w:sz w:val="20"/>
+                <w:szCs w:val="20"/>
+              </w:rPr>
+            </w:pPr>
+            <w:proofErr w:type="spellStart"/>
+            <w:r>
+              <w:rPr>
+                <w:b/>
+                <w:bCs/>
+                <w:color w:val="000000"/>
+                <w:sz w:val="20"/>
+                <w:szCs w:val="20"/>
+              </w:rPr>
+              <w:t>Transactional</w:t>
+            </w:r>
+            <w:proofErr w:type="spellEnd"/>
+            <w:r>
+              <w:rPr>
+                <w:b/>
+                <w:bCs/>
+                <w:color w:val="000000"/>
+                <w:sz w:val="20"/>
+                <w:szCs w:val="20"/>
+              </w:rPr>
+              <w:t xml:space="preserve"> Server</w:t>
+            </w:r>
+            <w:r>
+              <w:rPr>
+                <w:color w:val="000000"/>
+                <w:sz w:val="20"/>
+                <w:szCs w:val="20"/>
+              </w:rPr>
+              <w:t xml:space="preserve"> /</w:t>
+            </w:r>
+          </w:p>
+          <w:p>
+            <w:pPr>
+              <w:jc w:val="left"/>
+              <w:rPr>
+                <w:color w:val="000000"/>
+                <w:sz w:val="20"/>
+                <w:szCs w:val="20"/>
+              </w:rPr>
+            </w:pPr>
+            <w:r>
+              <w:rPr>
+                <w:color w:val="000000"/>
+                <w:sz w:val="20"/>
+                <w:szCs w:val="20"/>
+              </w:rPr>
+              <w:t>Servidor Transaccional (Secundario)</w:t>
+            </w:r>
+          </w:p>
+        </w:tc>
+        <w:tc>
+          <w:tcPr>
+            <w:tcW w:w="3078" w:type="pct"/>
+            <w:vAlign w:val="center"/>
+          </w:tcPr>
+          <w:p>
+            <w:pPr>
+              <w:jc w:val="left"/>
+              <w:rPr>
+                <w:color w:val="000000"/>
+                <w:sz w:val="20"/>
+                <w:szCs w:val="20"/>
+              </w:rPr>
+            </w:pPr>
+            <w:r>
+              <w:rPr>
+                <w:color w:val="000000"/>
+                <w:sz w:val="20"/>
+                <w:szCs w:val="20"/>
+              </w:rPr>
+              <w:t xml:space="preserve">Réplica en </w:t>
+            </w:r>
+            <w:r>
+              <w:rPr>
+                <w:color w:val="000000"/>
+                <w:sz w:val="20"/>
+                <w:szCs w:val="20"/>
+              </w:rPr>
+              <w:t>«</w:t>
+            </w:r>
+            <w:r>
+              <w:rPr>
+                <w:color w:val="000000"/>
+                <w:sz w:val="20"/>
+                <w:szCs w:val="20"/>
+              </w:rPr>
+              <w:t>caliente</w:t>
+            </w:r>
+            <w:r>
+              <w:rPr>
+                <w:color w:val="000000"/>
+                <w:sz w:val="20"/>
+                <w:szCs w:val="20"/>
+              </w:rPr>
+              <w:t>» (o en vivo)</w:t>
+            </w:r>
+            <w:r>
+              <w:rPr>
+                <w:color w:val="000000"/>
+                <w:sz w:val="20"/>
+                <w:szCs w:val="20"/>
+              </w:rPr>
+              <w:t xml:space="preserve"> del </w:t>
+            </w:r>
+            <w:r>
+              <w:rPr>
+                <w:color w:val="000000"/>
+                <w:sz w:val="20"/>
+                <w:szCs w:val="20"/>
+              </w:rPr>
+              <w:t xml:space="preserve">servidor </w:t>
+            </w:r>
+            <w:r>
+              <w:rPr>
+                <w:color w:val="000000"/>
+                <w:sz w:val="20"/>
+                <w:szCs w:val="20"/>
+              </w:rPr>
+              <w:t xml:space="preserve">primario para </w:t>
+            </w:r>
+            <w:proofErr w:type="spellStart"/>
+            <w:r>
+              <w:rPr>
+                <w:i/>
+                <w:iCs/>
+                <w:color w:val="000000"/>
+                <w:sz w:val="20"/>
+                <w:szCs w:val="20"/>
+              </w:rPr>
+              <w:t>fail-over</w:t>
+            </w:r>
+            <w:proofErr w:type="spellEnd"/>
+            <w:r>
+              <w:rPr>
+                <w:color w:val="000000"/>
+                <w:sz w:val="20"/>
+                <w:szCs w:val="20"/>
+              </w:rPr>
+              <w:t xml:space="preserve">; se mantiene sincronizado y puede tomar el relevo en caso de caída </w:t>
+            </w:r>
+            <w:r>
+              <w:rPr>
+                <w:color w:val="000000"/>
+                <w:sz w:val="20"/>
+                <w:szCs w:val="20"/>
+              </w:rPr>
+              <w:t xml:space="preserve">o baja </w:t>
+            </w:r>
+            <w:r>
+              <w:rPr>
+                <w:color w:val="000000"/>
+                <w:sz w:val="20"/>
+                <w:szCs w:val="20"/>
+              </w:rPr>
+              <w:t>del primario.</w:t>
+            </w:r>
+          </w:p>
+        </w:tc>
+      </w:tr>
+      <w:tr>
+        <w:tc>
+          <w:tcPr>
+            <w:tcW w:w="1922" w:type="pct"/>
+            <w:vAlign w:val="center"/>
+          </w:tcPr>
+          <w:p>
+            <w:pPr>
+              <w:jc w:val="left"/>
+              <w:rPr>
+                <w:color w:val="000000"/>
+                <w:sz w:val="20"/>
+                <w:szCs w:val="20"/>
+              </w:rPr>
+            </w:pPr>
+            <w:proofErr w:type="spellStart"/>
+            <w:r>
+              <w:rPr>
+                <w:b/>
+                <w:bCs/>
+                <w:color w:val="000000"/>
+                <w:sz w:val="20"/>
+                <w:szCs w:val="20"/>
+              </w:rPr>
+              <w:t>Transaction</w:t>
+            </w:r>
+            <w:proofErr w:type="spellEnd"/>
+            <w:r>
+              <w:rPr>
+                <w:b/>
+                <w:bCs/>
+                <w:color w:val="000000"/>
+                <w:sz w:val="20"/>
+                <w:szCs w:val="20"/>
+              </w:rPr>
+              <w:t xml:space="preserve"> Manager</w:t>
+            </w:r>
+            <w:r>
+              <w:rPr>
+                <w:color w:val="000000"/>
+                <w:sz w:val="20"/>
+                <w:szCs w:val="20"/>
+              </w:rPr>
+              <w:t xml:space="preserve"> / XA </w:t>
+            </w:r>
+            <w:proofErr w:type="spellStart"/>
+            <w:r>
+              <w:rPr>
+                <w:color w:val="000000"/>
+                <w:sz w:val="20"/>
+                <w:szCs w:val="20"/>
+              </w:rPr>
+              <w:t>Coordinator</w:t>
+            </w:r>
+            <w:proofErr w:type="spellEnd"/>
+          </w:p>
+        </w:tc>
+        <w:tc>
+          <w:tcPr>
+            <w:tcW w:w="3078" w:type="pct"/>
+            <w:vAlign w:val="center"/>
+          </w:tcPr>
+          <w:p>
+            <w:pPr>
+              <w:jc w:val="left"/>
+              <w:rPr>
+                <w:color w:val="000000"/>
+                <w:sz w:val="20"/>
+                <w:szCs w:val="20"/>
+              </w:rPr>
+            </w:pPr>
+            <w:r>
+              <w:rPr>
+                <w:color w:val="000000"/>
+                <w:sz w:val="20"/>
+                <w:szCs w:val="20"/>
+              </w:rPr>
+              <w:t>Orquesta transacciones distribuidas en dos fases (2PC) entre la base de datos y otros recursos (pools XA, colas), garantizando ACID</w:t>
+            </w:r>
+            <w:r>
+              <w:rPr>
+                <w:color w:val="000000"/>
+                <w:sz w:val="20"/>
+                <w:szCs w:val="20"/>
+              </w:rPr>
+              <w:t xml:space="preserve"> (</w:t>
+            </w:r>
+            <w:r>
+              <w:rPr>
+                <w:b/>
+                <w:bCs/>
+                <w:color w:val="000000"/>
+                <w:sz w:val="20"/>
+                <w:szCs w:val="20"/>
+              </w:rPr>
+              <w:t>A</w:t>
+            </w:r>
+            <w:r>
+              <w:rPr>
+                <w:color w:val="000000"/>
+                <w:sz w:val="20"/>
+                <w:szCs w:val="20"/>
+              </w:rPr>
+              <w:t xml:space="preserve">tomicidad, </w:t>
+            </w:r>
+            <w:r>
+              <w:rPr>
+                <w:b/>
+                <w:bCs/>
+                <w:color w:val="000000"/>
+                <w:sz w:val="20"/>
+                <w:szCs w:val="20"/>
+              </w:rPr>
+              <w:t>C</w:t>
+            </w:r>
+            <w:r>
+              <w:rPr>
+                <w:color w:val="000000"/>
+                <w:sz w:val="20"/>
+                <w:szCs w:val="20"/>
+              </w:rPr>
+              <w:t xml:space="preserve">onsistencia, </w:t>
+            </w:r>
+            <w:proofErr w:type="spellStart"/>
+            <w:r>
+              <w:rPr>
+                <w:b/>
+                <w:bCs/>
+                <w:color w:val="000000"/>
+                <w:sz w:val="20"/>
+                <w:szCs w:val="20"/>
+              </w:rPr>
+              <w:t>I</w:t>
+            </w:r>
+            <w:r>
+              <w:rPr>
+                <w:color w:val="000000"/>
+                <w:sz w:val="20"/>
+                <w:szCs w:val="20"/>
+              </w:rPr>
+              <w:t>solación</w:t>
+            </w:r>
+            <w:proofErr w:type="spellEnd"/>
+            <w:r>
+              <w:rPr>
+                <w:color w:val="000000"/>
+                <w:sz w:val="20"/>
+                <w:szCs w:val="20"/>
+              </w:rPr>
+              <w:t xml:space="preserve">, </w:t>
+            </w:r>
+            <w:r>
+              <w:rPr>
+                <w:b/>
+                <w:bCs/>
+                <w:color w:val="000000"/>
+                <w:sz w:val="20"/>
+                <w:szCs w:val="20"/>
+              </w:rPr>
+              <w:t>D</w:t>
+            </w:r>
+            <w:r>
+              <w:rPr>
+                <w:color w:val="000000"/>
+                <w:sz w:val="20"/>
+                <w:szCs w:val="20"/>
+              </w:rPr>
+              <w:t>urabilidad)</w:t>
+            </w:r>
+            <w:r>
+              <w:rPr>
+                <w:color w:val="000000"/>
+                <w:sz w:val="20"/>
+                <w:szCs w:val="20"/>
+              </w:rPr>
+              <w:t>.</w:t>
+            </w:r>
+          </w:p>
+        </w:tc>
+      </w:tr>
+      <w:tr>
+        <w:tc>
+          <w:tcPr>
+            <w:tcW w:w="1922" w:type="pct"/>
+            <w:vAlign w:val="center"/>
+          </w:tcPr>
+          <w:p>
+            <w:pPr>
+              <w:jc w:val="left"/>
+              <w:rPr>
+                <w:b/>
+                <w:bCs/>
+                <w:color w:val="000000"/>
+                <w:sz w:val="20"/>
+                <w:szCs w:val="20"/>
+              </w:rPr>
+            </w:pPr>
+            <w:r>
+              <w:rPr>
+                <w:b/>
+                <w:bCs/>
+                <w:color w:val="000000"/>
+                <w:sz w:val="20"/>
+                <w:szCs w:val="20"/>
+              </w:rPr>
+              <w:t>Pool de conexiones JDBC/XA</w:t>
+            </w:r>
+          </w:p>
+        </w:tc>
+        <w:tc>
+          <w:tcPr>
+            <w:tcW w:w="3078" w:type="pct"/>
+            <w:vAlign w:val="center"/>
+          </w:tcPr>
+          <w:p>
+            <w:pPr>
+              <w:jc w:val="left"/>
+              <w:rPr>
+                <w:color w:val="000000"/>
+                <w:sz w:val="20"/>
+                <w:szCs w:val="20"/>
+              </w:rPr>
+            </w:pPr>
+            <w:r>
+              <w:rPr>
+                <w:color w:val="000000"/>
+                <w:sz w:val="20"/>
+                <w:szCs w:val="20"/>
+              </w:rPr>
+              <w:t>Gestiona y reutiliza conexiones a Oracle con soporte XA, optimizando el rendimiento y habilitando transacciones distribuidas.</w:t>
+            </w:r>
+          </w:p>
+        </w:tc>
+      </w:tr>
+      <w:tr>
+        <w:tc>
+          <w:tcPr>
+            <w:tcW w:w="1922" w:type="pct"/>
+            <w:vAlign w:val="center"/>
+          </w:tcPr>
+          <w:p>
+            <w:pPr>
+              <w:jc w:val="left"/>
+              <w:rPr>
+                <w:b/>
+                <w:bCs/>
+                <w:color w:val="000000"/>
+                <w:sz w:val="20"/>
+                <w:szCs w:val="20"/>
+              </w:rPr>
+            </w:pPr>
+            <w:r>
+              <w:rPr>
+                <w:b/>
+                <w:bCs/>
+                <w:color w:val="000000"/>
+                <w:sz w:val="20"/>
+                <w:szCs w:val="20"/>
+              </w:rPr>
+              <w:t>Motor de reglas</w:t>
+            </w:r>
+          </w:p>
+        </w:tc>
+        <w:tc>
+          <w:tcPr>
+            <w:tcW w:w="3078" w:type="pct"/>
+            <w:vAlign w:val="center"/>
+          </w:tcPr>
+          <w:p>
+            <w:pPr>
+              <w:jc w:val="left"/>
+              <w:rPr>
+                <w:color w:val="000000"/>
+                <w:sz w:val="20"/>
+                <w:szCs w:val="20"/>
+              </w:rPr>
+            </w:pPr>
+            <w:r>
+              <w:rPr>
+                <w:color w:val="000000"/>
+                <w:sz w:val="20"/>
+                <w:szCs w:val="20"/>
+              </w:rPr>
+              <w:t xml:space="preserve">Subsistema que evalúa las reglas de negocio configurables (validaciones, descuentos, </w:t>
+            </w:r>
+            <w:r>
+              <w:rPr>
+                <w:color w:val="000000"/>
+                <w:sz w:val="20"/>
+                <w:szCs w:val="20"/>
+              </w:rPr>
+              <w:t>etc.</w:t>
+            </w:r>
+            <w:r>
+              <w:rPr>
+                <w:color w:val="000000"/>
+                <w:sz w:val="20"/>
+                <w:szCs w:val="20"/>
+              </w:rPr>
+              <w:t>) antes de confirmar el pedido.</w:t>
+            </w:r>
+          </w:p>
+        </w:tc>
+      </w:tr>
+      <w:tr>
+        <w:tc>
+          <w:tcPr>
+            <w:tcW w:w="1922" w:type="pct"/>
+            <w:vAlign w:val="center"/>
+          </w:tcPr>
+          <w:p>
+            <w:pPr>
+              <w:jc w:val="left"/>
+              <w:rPr>
+                <w:b/>
+                <w:bCs/>
+                <w:color w:val="000000"/>
+                <w:sz w:val="20"/>
+                <w:szCs w:val="20"/>
+              </w:rPr>
+            </w:pPr>
+            <w:r>
+              <w:rPr>
+                <w:b/>
+                <w:bCs/>
+                <w:color w:val="000000"/>
+                <w:sz w:val="20"/>
+                <w:szCs w:val="20"/>
+              </w:rPr>
+              <w:t>Validadores</w:t>
+            </w:r>
+          </w:p>
+        </w:tc>
+        <w:tc>
+          <w:tcPr>
+            <w:tcW w:w="3078" w:type="pct"/>
+            <w:vAlign w:val="center"/>
+          </w:tcPr>
+          <w:p>
+            <w:pPr>
+              <w:jc w:val="left"/>
+              <w:rPr>
+                <w:color w:val="000000"/>
+                <w:sz w:val="20"/>
+                <w:szCs w:val="20"/>
+              </w:rPr>
+            </w:pPr>
+            <w:r>
+              <w:rPr>
+                <w:color w:val="000000"/>
+                <w:sz w:val="20"/>
+                <w:szCs w:val="20"/>
+              </w:rPr>
+              <w:t>Componentes dedicados a chequeos específicos (</w:t>
+            </w:r>
+            <w:r>
+              <w:rPr>
+                <w:color w:val="000000"/>
+                <w:sz w:val="20"/>
+                <w:szCs w:val="20"/>
+              </w:rPr>
+              <w:t xml:space="preserve">como control de </w:t>
+            </w:r>
+            <w:r>
+              <w:rPr>
+                <w:color w:val="000000"/>
+                <w:sz w:val="20"/>
+                <w:szCs w:val="20"/>
+              </w:rPr>
+              <w:t>stock disponible, formatos de datos</w:t>
+            </w:r>
+            <w:r>
+              <w:rPr>
+                <w:color w:val="000000"/>
+                <w:sz w:val="20"/>
+                <w:szCs w:val="20"/>
+              </w:rPr>
+              <w:t>, etc.</w:t>
+            </w:r>
+            <w:r>
+              <w:rPr>
+                <w:color w:val="000000"/>
+                <w:sz w:val="20"/>
+                <w:szCs w:val="20"/>
+              </w:rPr>
+              <w:t xml:space="preserve">), </w:t>
+            </w:r>
+            <w:r>
+              <w:rPr>
+                <w:color w:val="000000"/>
+                <w:sz w:val="20"/>
+                <w:szCs w:val="20"/>
+              </w:rPr>
+              <w:t xml:space="preserve">que se </w:t>
+            </w:r>
+            <w:r>
+              <w:rPr>
+                <w:color w:val="000000"/>
+                <w:sz w:val="20"/>
+                <w:szCs w:val="20"/>
+              </w:rPr>
+              <w:t>invoca</w:t>
+            </w:r>
+            <w:r>
+              <w:rPr>
+                <w:color w:val="000000"/>
+                <w:sz w:val="20"/>
+                <w:szCs w:val="20"/>
+              </w:rPr>
+              <w:t xml:space="preserve">n </w:t>
+            </w:r>
+            <w:r>
+              <w:rPr>
+                <w:color w:val="000000"/>
+                <w:sz w:val="20"/>
+                <w:szCs w:val="20"/>
+              </w:rPr>
+              <w:t>desde los servicios de dominio.</w:t>
+            </w:r>
+          </w:p>
+        </w:tc>
+      </w:tr>
+      <w:tr>
+        <w:tc>
+          <w:tcPr>
+            <w:tcW w:w="1922" w:type="pct"/>
+            <w:vAlign w:val="center"/>
+          </w:tcPr>
+          <w:p>
+            <w:pPr>
+              <w:jc w:val="left"/>
+              <w:rPr>
+                <w:b/>
+                <w:bCs/>
+                <w:color w:val="000000"/>
+                <w:sz w:val="20"/>
+                <w:szCs w:val="20"/>
+              </w:rPr>
+            </w:pPr>
+            <w:r>
+              <w:rPr>
+                <w:b/>
+                <w:bCs/>
+                <w:color w:val="000000"/>
+                <w:sz w:val="20"/>
+                <w:szCs w:val="20"/>
+              </w:rPr>
+              <w:t>Componentes de servicio</w:t>
+            </w:r>
+          </w:p>
+        </w:tc>
+        <w:tc>
+          <w:tcPr>
+            <w:tcW w:w="3078" w:type="pct"/>
+            <w:vAlign w:val="center"/>
+          </w:tcPr>
+          <w:p>
+            <w:pPr>
+              <w:jc w:val="left"/>
+              <w:rPr>
+                <w:color w:val="000000"/>
+                <w:sz w:val="20"/>
+                <w:szCs w:val="20"/>
+              </w:rPr>
+            </w:pPr>
+            <w:r>
+              <w:rPr>
+                <w:color w:val="000000"/>
+                <w:sz w:val="20"/>
+                <w:szCs w:val="20"/>
+              </w:rPr>
+              <w:t>Servicios de dominio (</w:t>
+            </w:r>
+            <w:proofErr w:type="spellStart"/>
+            <w:r>
+              <w:rPr>
+                <w:color w:val="000000"/>
+                <w:sz w:val="20"/>
+                <w:szCs w:val="20"/>
+              </w:rPr>
+              <w:t>e.g</w:t>
+            </w:r>
+            <w:proofErr w:type="spellEnd"/>
+            <w:r>
+              <w:rPr>
+                <w:color w:val="000000"/>
+                <w:sz w:val="20"/>
+                <w:szCs w:val="20"/>
+              </w:rPr>
+              <w:t xml:space="preserve">. </w:t>
+            </w:r>
+            <w:proofErr w:type="spellStart"/>
+            <w:r>
+              <w:rPr>
+                <w:rFonts w:ascii="Courier New" w:hAnsi="Courier New" w:cs="Courier New"/>
+                <w:color w:val="000000"/>
+                <w:sz w:val="18"/>
+                <w:szCs w:val="18"/>
+                <w:highlight w:val="lightGray"/>
+              </w:rPr>
+              <w:t>PedidoService</w:t>
+            </w:r>
+            <w:proofErr w:type="spellEnd"/>
+            <w:r>
+              <w:rPr>
+                <w:color w:val="000000"/>
+                <w:sz w:val="20"/>
+                <w:szCs w:val="20"/>
+              </w:rPr>
+              <w:t xml:space="preserve">, </w:t>
+            </w:r>
+            <w:proofErr w:type="spellStart"/>
+            <w:r>
+              <w:rPr>
+                <w:rFonts w:ascii="Courier New" w:hAnsi="Courier New" w:cs="Courier New"/>
+                <w:color w:val="000000"/>
+                <w:sz w:val="18"/>
+                <w:szCs w:val="18"/>
+                <w:highlight w:val="lightGray"/>
+              </w:rPr>
+              <w:t>ClienteService</w:t>
+            </w:r>
+            <w:proofErr w:type="spellEnd"/>
+            <w:r>
+              <w:rPr>
+                <w:color w:val="000000"/>
+                <w:sz w:val="20"/>
+                <w:szCs w:val="20"/>
+              </w:rPr>
+              <w:t>) que encapsulan casos de uso (crear pedido, anular pedido, actualizar stock, etc.).</w:t>
+            </w:r>
+          </w:p>
+        </w:tc>
+      </w:tr>
+      <w:tr>
+        <w:tc>
+          <w:tcPr>
+            <w:tcW w:w="1922" w:type="pct"/>
+            <w:vAlign w:val="center"/>
+          </w:tcPr>
+          <w:p>
+            <w:pPr>
+              <w:jc w:val="left"/>
+              <w:rPr>
+                <w:b/>
+                <w:bCs/>
+                <w:color w:val="000000"/>
+                <w:sz w:val="20"/>
+                <w:szCs w:val="20"/>
+              </w:rPr>
+            </w:pPr>
+            <w:r>
+              <w:rPr>
+                <w:b/>
+                <w:bCs/>
+                <w:color w:val="000000"/>
+                <w:sz w:val="20"/>
+                <w:szCs w:val="20"/>
+              </w:rPr>
+              <w:t>BD Server</w:t>
+            </w:r>
+          </w:p>
+          <w:p>
+            <w:pPr>
+              <w:jc w:val="left"/>
+              <w:rPr>
+                <w:color w:val="000000"/>
+                <w:sz w:val="20"/>
+                <w:szCs w:val="20"/>
+              </w:rPr>
+            </w:pPr>
+            <w:r>
+              <w:rPr>
+                <w:color w:val="000000"/>
+                <w:sz w:val="20"/>
+                <w:szCs w:val="20"/>
+              </w:rPr>
+              <w:t>Oracle (</w:t>
+            </w:r>
+            <w:proofErr w:type="spellStart"/>
+            <w:r>
+              <w:rPr>
+                <w:color w:val="000000"/>
+                <w:sz w:val="20"/>
+                <w:szCs w:val="20"/>
+              </w:rPr>
+              <w:t>Primary</w:t>
+            </w:r>
+            <w:proofErr w:type="spellEnd"/>
+            <w:r>
+              <w:rPr>
+                <w:color w:val="000000"/>
+                <w:sz w:val="20"/>
+                <w:szCs w:val="20"/>
+              </w:rPr>
+              <w:t>)</w:t>
+            </w:r>
+          </w:p>
+        </w:tc>
+        <w:tc>
+          <w:tcPr>
+            <w:tcW w:w="3078" w:type="pct"/>
+            <w:vAlign w:val="center"/>
+          </w:tcPr>
+          <w:p>
+            <w:pPr>
+              <w:jc w:val="left"/>
+              <w:rPr>
+                <w:color w:val="000000"/>
+                <w:sz w:val="20"/>
+                <w:szCs w:val="20"/>
+              </w:rPr>
+            </w:pPr>
+            <w:r>
+              <w:rPr>
+                <w:color w:val="000000"/>
+                <w:sz w:val="20"/>
+                <w:szCs w:val="20"/>
+              </w:rPr>
+              <w:t>Base de datos principal (Oracle XE 21c sobre Oracle Linux), almacena tablas de pedidos, productos, logs y soporta todas las operaciones de escritura.</w:t>
+            </w:r>
+          </w:p>
+        </w:tc>
+      </w:tr>
+      <w:tr>
+        <w:tc>
+          <w:tcPr>
+            <w:tcW w:w="1922" w:type="pct"/>
+            <w:vAlign w:val="center"/>
+          </w:tcPr>
+          <w:p>
+            <w:pPr>
+              <w:jc w:val="left"/>
+              <w:rPr>
+                <w:b/>
+                <w:bCs/>
+                <w:color w:val="000000"/>
+                <w:sz w:val="20"/>
+                <w:szCs w:val="20"/>
+                <w:lang w:val="en-US"/>
+              </w:rPr>
+            </w:pPr>
+            <w:r>
+              <w:rPr>
+                <w:b/>
+                <w:bCs/>
+                <w:color w:val="000000"/>
+                <w:sz w:val="20"/>
+                <w:szCs w:val="20"/>
+                <w:lang w:val="en-US"/>
+              </w:rPr>
+              <w:t xml:space="preserve">BD </w:t>
+            </w:r>
+            <w:proofErr w:type="spellStart"/>
+            <w:r>
+              <w:rPr>
+                <w:b/>
+                <w:bCs/>
+                <w:color w:val="000000"/>
+                <w:sz w:val="20"/>
+                <w:szCs w:val="20"/>
+                <w:lang w:val="en-US"/>
+              </w:rPr>
+              <w:t>Réplica</w:t>
+            </w:r>
+            <w:proofErr w:type="spellEnd"/>
+          </w:p>
+          <w:p>
+            <w:pPr>
+              <w:jc w:val="left"/>
+              <w:rPr>
+                <w:color w:val="000000"/>
+                <w:sz w:val="20"/>
+                <w:szCs w:val="20"/>
+                <w:lang w:val="en-US"/>
+              </w:rPr>
+            </w:pPr>
+            <w:r>
+              <w:rPr>
+                <w:color w:val="000000"/>
+                <w:sz w:val="20"/>
+                <w:szCs w:val="20"/>
+                <w:lang w:val="en-US"/>
+              </w:rPr>
+              <w:t>Oracle Data Guard (Standby)</w:t>
+            </w:r>
+          </w:p>
+        </w:tc>
+        <w:tc>
+          <w:tcPr>
+            <w:tcW w:w="3078" w:type="pct"/>
+            <w:vAlign w:val="center"/>
+          </w:tcPr>
+          <w:p>
+            <w:pPr>
+              <w:jc w:val="left"/>
+              <w:rPr>
+                <w:color w:val="000000"/>
+                <w:sz w:val="20"/>
+                <w:szCs w:val="20"/>
+              </w:rPr>
+            </w:pPr>
+            <w:r>
+              <w:rPr>
+                <w:color w:val="000000"/>
+                <w:sz w:val="20"/>
+                <w:szCs w:val="20"/>
+              </w:rPr>
+              <w:t xml:space="preserve">Instancia en modo </w:t>
+            </w:r>
+            <w:proofErr w:type="spellStart"/>
+            <w:r>
+              <w:rPr>
+                <w:i/>
+                <w:iCs/>
+                <w:color w:val="000000"/>
+                <w:sz w:val="20"/>
+                <w:szCs w:val="20"/>
+              </w:rPr>
+              <w:t>read-only</w:t>
+            </w:r>
+            <w:proofErr w:type="spellEnd"/>
+            <w:r>
+              <w:rPr>
+                <w:color w:val="000000"/>
+                <w:sz w:val="20"/>
+                <w:szCs w:val="20"/>
+              </w:rPr>
+              <w:t xml:space="preserve"> que replica de forma síncrona la </w:t>
+            </w:r>
+            <w:r>
+              <w:rPr>
+                <w:color w:val="000000"/>
+                <w:sz w:val="20"/>
+                <w:szCs w:val="20"/>
+              </w:rPr>
+              <w:t xml:space="preserve">BD </w:t>
+            </w:r>
+            <w:r>
+              <w:rPr>
+                <w:color w:val="000000"/>
+                <w:sz w:val="20"/>
+                <w:szCs w:val="20"/>
+              </w:rPr>
+              <w:t>primaria</w:t>
+            </w:r>
+            <w:r>
+              <w:rPr>
+                <w:color w:val="000000"/>
+                <w:sz w:val="20"/>
+                <w:szCs w:val="20"/>
+              </w:rPr>
+              <w:t xml:space="preserve">. Principalmente se usará como </w:t>
+            </w:r>
+            <w:proofErr w:type="spellStart"/>
+            <w:r>
+              <w:rPr>
+                <w:i/>
+                <w:iCs/>
+                <w:color w:val="000000"/>
+                <w:sz w:val="20"/>
+                <w:szCs w:val="20"/>
+              </w:rPr>
+              <w:t>fail-over</w:t>
+            </w:r>
+            <w:proofErr w:type="spellEnd"/>
+            <w:r>
+              <w:rPr>
+                <w:color w:val="000000"/>
+                <w:sz w:val="20"/>
+                <w:szCs w:val="20"/>
+              </w:rPr>
+              <w:t xml:space="preserve"> ante caída </w:t>
+            </w:r>
+            <w:r>
+              <w:rPr>
+                <w:color w:val="000000"/>
+                <w:sz w:val="20"/>
+                <w:szCs w:val="20"/>
+              </w:rPr>
+              <w:t xml:space="preserve">o baja </w:t>
+            </w:r>
+            <w:r>
+              <w:rPr>
+                <w:color w:val="000000"/>
+                <w:sz w:val="20"/>
+                <w:szCs w:val="20"/>
+              </w:rPr>
+              <w:t xml:space="preserve">de la </w:t>
+            </w:r>
+            <w:r>
+              <w:rPr>
+                <w:color w:val="000000"/>
+                <w:sz w:val="20"/>
+                <w:szCs w:val="20"/>
+              </w:rPr>
+              <w:t xml:space="preserve">BD </w:t>
+            </w:r>
+            <w:r>
+              <w:rPr>
+                <w:color w:val="000000"/>
+                <w:sz w:val="20"/>
+                <w:szCs w:val="20"/>
+              </w:rPr>
+              <w:t>principal</w:t>
+            </w:r>
+            <w:r>
+              <w:rPr>
+                <w:color w:val="000000"/>
+                <w:sz w:val="20"/>
+                <w:szCs w:val="20"/>
+              </w:rPr>
+              <w:t xml:space="preserve">; aunque también se puede aprovechar para realizar tareas de </w:t>
+            </w:r>
+            <w:r>
+              <w:rPr>
+                <w:color w:val="000000"/>
+                <w:sz w:val="20"/>
+                <w:szCs w:val="20"/>
+              </w:rPr>
+              <w:t>análisis</w:t>
+            </w:r>
+            <w:r>
+              <w:rPr>
+                <w:color w:val="000000"/>
+                <w:sz w:val="20"/>
+                <w:szCs w:val="20"/>
+              </w:rPr>
+              <w:t xml:space="preserve"> y</w:t>
+            </w:r>
+            <w:r>
+              <w:rPr>
+                <w:color w:val="000000"/>
+                <w:sz w:val="20"/>
+                <w:szCs w:val="20"/>
+              </w:rPr>
+              <w:t xml:space="preserve"> reportes</w:t>
+            </w:r>
+            <w:r>
+              <w:rPr>
+                <w:color w:val="000000"/>
+                <w:sz w:val="20"/>
+                <w:szCs w:val="20"/>
+              </w:rPr>
+              <w:t>, sin sobrecargar la BD principal.</w:t>
+            </w:r>
+          </w:p>
+        </w:tc>
+      </w:tr>
+    </w:tbl>
+    <w:p>
+      <w:pPr>
+        <w:spacing w:after="200" w:line="360" w:lineRule="auto"/>
+        <w:rPr>
+          <w:rFonts w:eastAsiaTheme="majorEastAsia" w:cstheme="majorBidi"/>
+          <w:b/>
+          <w:bCs/>
+          <w:sz w:val="28"/>
+          <w:szCs w:val="28"/>
+        </w:rPr>
+      </w:pPr>
+      <w:bookmarkStart w:id="4" w:name="_Toc199145175"/>
+      <w:r>
+        <w:br w:type="page"/>
+      </w:r>
+    </w:p>
     <w:p>
       <w:pPr>
         <w:pStyle w:val="Ttulo1"/>
       </w:pPr>
-      <w:bookmarkStart w:id="4" w:name="_Toc199145175"/>
       <w:r>
+        <w:lastRenderedPageBreak/>
         <w:t>Sección 3</w:t>
       </w:r>
       <w:r>
@@ -1500,13 +3280,13 @@
     </w:p>
     <w:p>
       <w:r>
-        <w:t>Tabla</w:t>
+        <w:t>Como ya venía anticipando al identificar los componentes en el diagrama de la sección 1 (y posteriormente en la tabla de descripción), sugiero los siguientes productos de software para todos los componentes antes mencionados:</w:t>
       </w:r>
     </w:p>
     <w:p/>
     <w:p/>
     <w:sectPr>
-      <w:footerReference w:type="default" r:id="rId20"/>
+      <w:footerReference w:type="default" r:id="rId21"/>
       <w:pgSz w:w="11906" w:h="16838"/>
       <w:pgMar w:top="2127" w:right="1247" w:bottom="1701" w:left="1814" w:header="709" w:footer="709" w:gutter="0"/>
       <w:pgNumType w:start="1"/>
@@ -3569,13 +5349,12 @@
   <w:style w:type="paragraph" w:default="1" w:styleId="Normal">
     <w:name w:val="Normal"/>
     <w:qFormat/>
-    <w:rsid w:val="00E414C4"/>
+    <w:rsid w:val="00EC087E"/>
     <w:pPr>
       <w:spacing w:after="0" w:line="240" w:lineRule="auto"/>
     </w:pPr>
     <w:rPr>
       <w:rFonts w:eastAsiaTheme="minorEastAsia"/>
-      <w:sz w:val="22"/>
     </w:rPr>
   </w:style>
   <w:style w:type="paragraph" w:styleId="Ttulo1">
@@ -3617,7 +5396,6 @@
       <w:rFonts w:eastAsiaTheme="majorEastAsia" w:cstheme="majorBidi"/>
       <w:b/>
       <w:bCs/>
-      <w:sz w:val="24"/>
       <w:szCs w:val="26"/>
     </w:rPr>
   </w:style>
@@ -15786,28 +17564,28 @@
 </file>
 
 <file path=customXml/item1.xml><?xml version="1.0" encoding="utf-8"?>
-<b:Sources xmlns:b="http://schemas.openxmlformats.org/officeDocument/2006/bibliography" xmlns="http://schemas.openxmlformats.org/officeDocument/2006/bibliography" SelectedStyle="\APASixthEditionOfficeOnline.xsl" StyleName="APA" Version="6"/>
-</file>
-
-<file path=customXml/item2.xml><?xml version="1.0" encoding="utf-8"?>
 <go:gDocsCustomXmlDataStorage xmlns:go="http://customooxmlschemas.google.com/" xmlns:r="http://schemas.openxmlformats.org/officeDocument/2006/relationships">
   <go:docsCustomData xmlns:go="http://customooxmlschemas.google.com/" roundtripDataSignature="AMtx7mguBxdkhaGz01udNDo5UlRuH4Qt/A==">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</go:docsCustomData>
 </go:gDocsCustomXmlDataStorage>
 </file>
 
-<file path=customXml/itemProps1.xml><?xml version="1.0" encoding="utf-8"?>
-<ds:datastoreItem xmlns:ds="http://schemas.openxmlformats.org/officeDocument/2006/customXml" ds:itemID="{AE030073-6319-4592-A707-9629370D22F9}">
-  <ds:schemaRefs>
-    <ds:schemaRef ds:uri="http://schemas.openxmlformats.org/officeDocument/2006/bibliography"/>
-  </ds:schemaRefs>
-</ds:datastoreItem>
+<file path=customXml/item2.xml><?xml version="1.0" encoding="utf-8"?>
+<b:Sources xmlns:b="http://schemas.openxmlformats.org/officeDocument/2006/bibliography" xmlns="http://schemas.openxmlformats.org/officeDocument/2006/bibliography" SelectedStyle="\APASixthEditionOfficeOnline.xsl" StyleName="APA" Version="6"/>
 </file>
 
-<file path=customXml/itemProps2.xml><?xml version="1.0" encoding="utf-8"?>
+<file path=customXml/itemProps1.xml><?xml version="1.0" encoding="utf-8"?>
 <ds:datastoreItem xmlns:ds="http://schemas.openxmlformats.org/officeDocument/2006/customXml" ds:itemID="{11111111-1234-1234-1234-123412341234}">
   <ds:schemaRefs>
     <ds:schemaRef ds:uri="http://customooxmlschemas.google.com/"/>
     <ds:schemaRef ds:uri="http://schemas.openxmlformats.org/officeDocument/2006/relationships"/>
   </ds:schemaRefs>
 </ds:datastoreItem>
+</file>
+
+<file path=customXml/itemProps2.xml><?xml version="1.0" encoding="utf-8"?>
+<ds:datastoreItem xmlns:ds="http://schemas.openxmlformats.org/officeDocument/2006/customXml" ds:itemID="{AE030073-6319-4592-A707-9629370D22F9}">
+  <ds:schemaRefs>
+    <ds:schemaRef ds:uri="http://schemas.openxmlformats.org/officeDocument/2006/bibliography"/>
+  </ds:schemaRefs>
+</ds:datastoreItem>
 </file>
</xml_diff>